<commit_message>
Add PageBreak element to AST and all renderers
Introduces a PageBreak block element that forces a new page in the
rendered output. Supported in PDF (add_page), DOCX (add_page_break),
and HTML (hr with page-break-after style). Added to example.

https://claude.ai/code/session_01SxvyLgUV2FUhsqyEzrPq5Q
</commit_message>
<xml_diff>
--- a/example.docx
+++ b/example.docx
@@ -176,6 +176,11 @@
       </w:pPr>
       <w:r>
         <w:t>Like this paragraph.</w:t>
+      </w:r>
+    </w:p>
+    <w:p>
+      <w:r>
+        <w:br w:type="page"/>
       </w:r>
     </w:p>
     <w:p>

</xml_diff>